<commit_message>
Chapter 3 detection-rate table: move the caption below the table
Render the descriptive paragraph for the detection-rate table below the table
instead of above it (as a centered caption), and make the below-table note style a
centered 9 pt gray caption (also tidies the polygon-size table's note).

Co-Authored-By: Claude Opus 4.8 (1M context) <noreply@anthropic.com>
</commit_message>
<xml_diff>
--- a/manuscript_formatting/chapter_3/tables/chapter3_table_detection_rate_by_cell_size.docx
+++ b/manuscript_formatting/chapter_3/tables/chapter3_table_detection_rate_by_cell_size.docx
@@ -14,21 +14,6 @@
           <w:sz w:val="26"/>
         </w:rPr>
         <w:t>Per-Agent Change Detection Rate by Grid Cell Size</w:t>
-      </w:r>
-    </w:p>
-    <w:p>
-      <w:pPr>
-        <w:spacing w:after="120" w:before="0"/>
-      </w:pPr>
-      <w:r>
-        <w:rPr>
-          <w:rFonts w:ascii="Times New Roman" w:hAnsi="Times New Roman"/>
-          <w:b w:val="0"/>
-          <w:i w:val="0"/>
-          <w:color w:val="333333"/>
-          <w:sz w:val="20"/>
-        </w:rPr>
-        <w:t>Fraction of complete cells, fully within the seven-watershed area of interest (AOI), that contain at least one polygon of each change agent, by grid cell size. Detection rate is n_with_change divided by n_cells_complete. The 112 pixel cell (11.29 square kilometers), the selected size, is shown in bold. GLKN change polygons, 2010 to 2020.</w:t>
       </w:r>
     </w:p>
     <w:tbl>
@@ -1074,6 +1059,21 @@
         </w:tc>
       </w:tr>
     </w:tbl>
+    <w:p>
+      <w:pPr>
+        <w:spacing w:after="0" w:before="120"/>
+      </w:pPr>
+      <w:r>
+        <w:rPr>
+          <w:rFonts w:ascii="Times New Roman" w:hAnsi="Times New Roman"/>
+          <w:b w:val="0"/>
+          <w:i w:val="0"/>
+          <w:color w:val="404040"/>
+          <w:sz w:val="18"/>
+        </w:rPr>
+        <w:t>Fraction of complete cells, fully within the seven-watershed area of interest (AOI), that contain at least one polygon of each change agent, by grid cell size. Detection rate is n_with_change divided by n_cells_complete. The 112 pixel cell (11.29 square kilometers), the selected size, is shown in bold. GLKN change polygons, 2010 to 2020.</w:t>
+      </w:r>
+    </w:p>
     <w:sectPr>
       <w:pgSz w:w="12240" w:h="15840"/>
       <w:pgMar w:top="1440" w:right="1800" w:bottom="1440" w:left="1800" w:header="720" w:footer="720" w:gutter="0"/>

</xml_diff>